<commit_message>
Made a function that collects country+year data for matrices like Tc
</commit_message>
<xml_diff>
--- a/Trending/Data for ttrending.docx
+++ b/Trending/Data for ttrending.docx
@@ -19,9 +19,8 @@
           <w:szCs w:val="24"/>
           <w:lang w:val="en-US"/>
         </w:rPr>
-        <w:t xml:space="preserve">Data for </w:t>
+        <w:t xml:space="preserve">   </w:t>
       </w:r>
-      <w:proofErr w:type="spellStart"/>
       <w:r>
         <w:rPr>
           <w:rFonts w:asciiTheme="majorBidi" w:hAnsiTheme="majorBidi" w:cstheme="majorBidi"/>
@@ -29,9 +28,8 @@
           <w:szCs w:val="24"/>
           <w:lang w:val="en-US"/>
         </w:rPr>
-        <w:t>ttrending</w:t>
+        <w:t>Data for trending</w:t>
       </w:r>
-      <w:proofErr w:type="spellEnd"/>
     </w:p>
     <w:p>
       <w:pPr>
@@ -119,7 +117,6 @@
           <w:lang w:val="en-US"/>
         </w:rPr>
       </w:pPr>
-      <w:proofErr w:type="spellStart"/>
       <w:r>
         <w:rPr>
           <w:rFonts w:asciiTheme="minorBidi" w:hAnsiTheme="minorBidi"/>
@@ -127,7 +124,6 @@
         </w:rPr>
         <w:t>Worldbank</w:t>
       </w:r>
-      <w:proofErr w:type="spellEnd"/>
     </w:p>
     <w:p>
       <w:pPr>
@@ -137,21 +133,12 @@
           <w:lang w:val="en-US"/>
         </w:rPr>
       </w:pPr>
-      <w:proofErr w:type="spellStart"/>
       <w:r>
         <w:rPr>
           <w:rFonts w:asciiTheme="minorBidi" w:hAnsiTheme="minorBidi"/>
           <w:lang w:val="en-US"/>
         </w:rPr>
-        <w:t>Ndori</w:t>
-      </w:r>
-      <w:proofErr w:type="spellEnd"/>
-      <w:r>
-        <w:rPr>
-          <w:rFonts w:asciiTheme="minorBidi" w:hAnsiTheme="minorBidi"/>
-          <w:lang w:val="en-US"/>
-        </w:rPr>
-        <w:t>…</w:t>
+        <w:t>Ndori…</w:t>
       </w:r>
     </w:p>
     <w:p>
@@ -220,6 +207,15 @@
           <w:lang w:val="en-US"/>
         </w:rPr>
       </w:pPr>
+      <w:r>
+        <w:rPr>
+          <w:rFonts w:asciiTheme="majorBidi" w:hAnsiTheme="majorBidi" w:cstheme="majorBidi"/>
+          <w:sz w:val="24"/>
+          <w:szCs w:val="24"/>
+          <w:lang w:val="en-US"/>
+        </w:rPr>
+        <w:t>https://data360.worldbank.org/en/search</w:t>
+      </w:r>
     </w:p>
     <w:p>
       <w:pPr>
@@ -250,7 +246,6 @@
           <w:rFonts w:asciiTheme="majorBidi" w:hAnsiTheme="majorBidi" w:cstheme="majorBidi"/>
           <w:sz w:val="24"/>
           <w:szCs w:val="24"/>
-          <w:lang w:val="en-IL"/>
         </w:rPr>
       </w:pPr>
       <w:r>
@@ -258,7 +253,6 @@
           <w:rFonts w:asciiTheme="majorBidi" w:hAnsiTheme="majorBidi" w:cstheme="majorBidi"/>
           <w:sz w:val="24"/>
           <w:szCs w:val="24"/>
-          <w:lang w:val="en-IL"/>
         </w:rPr>
         <w:t>'HFCE', 'NPISH',    'GGFC', 'GFCF', 'INVNT', 'CONS_NONRES', 'EXPO'</w:t>
       </w:r>
@@ -300,7 +294,6 @@
                 <w:bCs/>
                 <w:sz w:val="24"/>
                 <w:szCs w:val="24"/>
-                <w:lang w:val="en-IL"/>
               </w:rPr>
             </w:pPr>
             <w:r>
@@ -310,7 +303,6 @@
                 <w:bCs/>
                 <w:sz w:val="24"/>
                 <w:szCs w:val="24"/>
-                <w:lang w:val="en-IL"/>
               </w:rPr>
               <w:t>Code</w:t>
             </w:r>
@@ -331,7 +323,6 @@
                 <w:bCs/>
                 <w:sz w:val="24"/>
                 <w:szCs w:val="24"/>
-                <w:lang w:val="en-IL"/>
               </w:rPr>
             </w:pPr>
             <w:r>
@@ -341,7 +332,6 @@
                 <w:bCs/>
                 <w:sz w:val="24"/>
                 <w:szCs w:val="24"/>
-                <w:lang w:val="en-IL"/>
               </w:rPr>
               <w:t>Full Name</w:t>
             </w:r>
@@ -362,7 +352,6 @@
                 <w:bCs/>
                 <w:sz w:val="24"/>
                 <w:szCs w:val="24"/>
-                <w:lang w:val="en-IL"/>
               </w:rPr>
             </w:pPr>
             <w:r>
@@ -372,7 +361,6 @@
                 <w:bCs/>
                 <w:sz w:val="24"/>
                 <w:szCs w:val="24"/>
-                <w:lang w:val="en-IL"/>
               </w:rPr>
               <w:t>Description</w:t>
             </w:r>
@@ -396,7 +384,6 @@
                 <w:rFonts w:asciiTheme="majorBidi" w:hAnsiTheme="majorBidi" w:cstheme="majorBidi"/>
                 <w:sz w:val="24"/>
                 <w:szCs w:val="24"/>
-                <w:lang w:val="en-IL"/>
               </w:rPr>
             </w:pPr>
             <w:r>
@@ -406,7 +393,6 @@
                 <w:bCs/>
                 <w:sz w:val="24"/>
                 <w:szCs w:val="24"/>
-                <w:lang w:val="en-IL"/>
               </w:rPr>
               <w:t>HFCE</w:t>
             </w:r>
@@ -425,15 +411,13 @@
                 <w:rFonts w:asciiTheme="majorBidi" w:hAnsiTheme="majorBidi" w:cstheme="majorBidi"/>
                 <w:sz w:val="24"/>
                 <w:szCs w:val="24"/>
-                <w:lang w:val="en-IL"/>
-              </w:rPr>
-            </w:pPr>
-            <w:r>
-              <w:rPr>
-                <w:rFonts w:asciiTheme="majorBidi" w:hAnsiTheme="majorBidi" w:cstheme="majorBidi"/>
-                <w:sz w:val="24"/>
-                <w:szCs w:val="24"/>
-                <w:lang w:val="en-IL"/>
+              </w:rPr>
+            </w:pPr>
+            <w:r>
+              <w:rPr>
+                <w:rFonts w:asciiTheme="majorBidi" w:hAnsiTheme="majorBidi" w:cstheme="majorBidi"/>
+                <w:sz w:val="24"/>
+                <w:szCs w:val="24"/>
               </w:rPr>
               <w:t>Household Final Consumption Expenditure</w:t>
             </w:r>
@@ -452,15 +436,13 @@
                 <w:rFonts w:asciiTheme="majorBidi" w:hAnsiTheme="majorBidi" w:cstheme="majorBidi"/>
                 <w:sz w:val="24"/>
                 <w:szCs w:val="24"/>
-                <w:lang w:val="en-IL"/>
-              </w:rPr>
-            </w:pPr>
-            <w:r>
-              <w:rPr>
-                <w:rFonts w:asciiTheme="majorBidi" w:hAnsiTheme="majorBidi" w:cstheme="majorBidi"/>
-                <w:sz w:val="24"/>
-                <w:szCs w:val="24"/>
-                <w:lang w:val="en-IL"/>
+              </w:rPr>
+            </w:pPr>
+            <w:r>
+              <w:rPr>
+                <w:rFonts w:asciiTheme="majorBidi" w:hAnsiTheme="majorBidi" w:cstheme="majorBidi"/>
+                <w:sz w:val="24"/>
+                <w:szCs w:val="24"/>
               </w:rPr>
               <w:t>Spending by households on goods &amp; services, excluding NPISH and government.</w:t>
             </w:r>
@@ -484,7 +466,6 @@
                 <w:rFonts w:asciiTheme="majorBidi" w:hAnsiTheme="majorBidi" w:cstheme="majorBidi"/>
                 <w:sz w:val="24"/>
                 <w:szCs w:val="24"/>
-                <w:lang w:val="en-IL"/>
               </w:rPr>
             </w:pPr>
             <w:r>
@@ -494,7 +475,6 @@
                 <w:bCs/>
                 <w:sz w:val="24"/>
                 <w:szCs w:val="24"/>
-                <w:lang w:val="en-IL"/>
               </w:rPr>
               <w:t>NPISH</w:t>
             </w:r>
@@ -513,15 +493,13 @@
                 <w:rFonts w:asciiTheme="majorBidi" w:hAnsiTheme="majorBidi" w:cstheme="majorBidi"/>
                 <w:sz w:val="24"/>
                 <w:szCs w:val="24"/>
-                <w:lang w:val="en-IL"/>
-              </w:rPr>
-            </w:pPr>
-            <w:r>
-              <w:rPr>
-                <w:rFonts w:asciiTheme="majorBidi" w:hAnsiTheme="majorBidi" w:cstheme="majorBidi"/>
-                <w:sz w:val="24"/>
-                <w:szCs w:val="24"/>
-                <w:lang w:val="en-IL"/>
+              </w:rPr>
+            </w:pPr>
+            <w:r>
+              <w:rPr>
+                <w:rFonts w:asciiTheme="majorBidi" w:hAnsiTheme="majorBidi" w:cstheme="majorBidi"/>
+                <w:sz w:val="24"/>
+                <w:szCs w:val="24"/>
               </w:rPr>
               <w:t>Non-Profit Institutions Serving Households</w:t>
             </w:r>
@@ -540,15 +518,13 @@
                 <w:rFonts w:asciiTheme="majorBidi" w:hAnsiTheme="majorBidi" w:cstheme="majorBidi"/>
                 <w:sz w:val="24"/>
                 <w:szCs w:val="24"/>
-                <w:lang w:val="en-IL"/>
-              </w:rPr>
-            </w:pPr>
-            <w:r>
-              <w:rPr>
-                <w:rFonts w:asciiTheme="majorBidi" w:hAnsiTheme="majorBidi" w:cstheme="majorBidi"/>
-                <w:sz w:val="24"/>
-                <w:szCs w:val="24"/>
-                <w:lang w:val="en-IL"/>
+              </w:rPr>
+            </w:pPr>
+            <w:r>
+              <w:rPr>
+                <w:rFonts w:asciiTheme="majorBidi" w:hAnsiTheme="majorBidi" w:cstheme="majorBidi"/>
+                <w:sz w:val="24"/>
+                <w:szCs w:val="24"/>
               </w:rPr>
               <w:t>Final consumption by charities, religious orgs, etc., serving households for free.</w:t>
             </w:r>
@@ -572,7 +548,6 @@
                 <w:rFonts w:asciiTheme="majorBidi" w:hAnsiTheme="majorBidi" w:cstheme="majorBidi"/>
                 <w:sz w:val="24"/>
                 <w:szCs w:val="24"/>
-                <w:lang w:val="en-IL"/>
               </w:rPr>
             </w:pPr>
             <w:r>
@@ -582,7 +557,6 @@
                 <w:bCs/>
                 <w:sz w:val="24"/>
                 <w:szCs w:val="24"/>
-                <w:lang w:val="en-IL"/>
               </w:rPr>
               <w:t>GGFC</w:t>
             </w:r>
@@ -601,15 +575,13 @@
                 <w:rFonts w:asciiTheme="majorBidi" w:hAnsiTheme="majorBidi" w:cstheme="majorBidi"/>
                 <w:sz w:val="24"/>
                 <w:szCs w:val="24"/>
-                <w:lang w:val="en-IL"/>
-              </w:rPr>
-            </w:pPr>
-            <w:r>
-              <w:rPr>
-                <w:rFonts w:asciiTheme="majorBidi" w:hAnsiTheme="majorBidi" w:cstheme="majorBidi"/>
-                <w:sz w:val="24"/>
-                <w:szCs w:val="24"/>
-                <w:lang w:val="en-IL"/>
+              </w:rPr>
+            </w:pPr>
+            <w:r>
+              <w:rPr>
+                <w:rFonts w:asciiTheme="majorBidi" w:hAnsiTheme="majorBidi" w:cstheme="majorBidi"/>
+                <w:sz w:val="24"/>
+                <w:szCs w:val="24"/>
               </w:rPr>
               <w:t>Government Final Consumption</w:t>
             </w:r>
@@ -628,37 +600,15 @@
                 <w:rFonts w:asciiTheme="majorBidi" w:hAnsiTheme="majorBidi" w:cstheme="majorBidi"/>
                 <w:sz w:val="24"/>
                 <w:szCs w:val="24"/>
-                <w:lang w:val="en-IL"/>
-              </w:rPr>
-            </w:pPr>
-            <w:r>
-              <w:rPr>
-                <w:rFonts w:asciiTheme="majorBidi" w:hAnsiTheme="majorBidi" w:cstheme="majorBidi"/>
-                <w:sz w:val="24"/>
-                <w:szCs w:val="24"/>
-                <w:lang w:val="en-IL"/>
-              </w:rPr>
-              <w:t xml:space="preserve">Government spending on goods &amp; services consumed by the public (e.g., health, </w:t>
-            </w:r>
-            <w:proofErr w:type="spellStart"/>
-            <w:r>
-              <w:rPr>
-                <w:rFonts w:asciiTheme="majorBidi" w:hAnsiTheme="majorBidi" w:cstheme="majorBidi"/>
-                <w:sz w:val="24"/>
-                <w:szCs w:val="24"/>
-                <w:lang w:val="en-IL"/>
-              </w:rPr>
-              <w:t>defense</w:t>
-            </w:r>
-            <w:proofErr w:type="spellEnd"/>
-            <w:r>
-              <w:rPr>
-                <w:rFonts w:asciiTheme="majorBidi" w:hAnsiTheme="majorBidi" w:cstheme="majorBidi"/>
-                <w:sz w:val="24"/>
-                <w:szCs w:val="24"/>
-                <w:lang w:val="en-IL"/>
-              </w:rPr>
-              <w:t>).</w:t>
+              </w:rPr>
+            </w:pPr>
+            <w:r>
+              <w:rPr>
+                <w:rFonts w:asciiTheme="majorBidi" w:hAnsiTheme="majorBidi" w:cstheme="majorBidi"/>
+                <w:sz w:val="24"/>
+                <w:szCs w:val="24"/>
+              </w:rPr>
+              <w:t>Government spending on goods &amp; services consumed by the public (e.g., health, defense).</w:t>
             </w:r>
           </w:p>
         </w:tc>
@@ -680,7 +630,6 @@
                 <w:rFonts w:asciiTheme="majorBidi" w:hAnsiTheme="majorBidi" w:cstheme="majorBidi"/>
                 <w:sz w:val="24"/>
                 <w:szCs w:val="24"/>
-                <w:lang w:val="en-IL"/>
               </w:rPr>
             </w:pPr>
             <w:r>
@@ -690,7 +639,6 @@
                 <w:bCs/>
                 <w:sz w:val="24"/>
                 <w:szCs w:val="24"/>
-                <w:lang w:val="en-IL"/>
               </w:rPr>
               <w:t>GFCF</w:t>
             </w:r>
@@ -709,15 +657,13 @@
                 <w:rFonts w:asciiTheme="majorBidi" w:hAnsiTheme="majorBidi" w:cstheme="majorBidi"/>
                 <w:sz w:val="24"/>
                 <w:szCs w:val="24"/>
-                <w:lang w:val="en-IL"/>
-              </w:rPr>
-            </w:pPr>
-            <w:r>
-              <w:rPr>
-                <w:rFonts w:asciiTheme="majorBidi" w:hAnsiTheme="majorBidi" w:cstheme="majorBidi"/>
-                <w:sz w:val="24"/>
-                <w:szCs w:val="24"/>
-                <w:lang w:val="en-IL"/>
+              </w:rPr>
+            </w:pPr>
+            <w:r>
+              <w:rPr>
+                <w:rFonts w:asciiTheme="majorBidi" w:hAnsiTheme="majorBidi" w:cstheme="majorBidi"/>
+                <w:sz w:val="24"/>
+                <w:szCs w:val="24"/>
               </w:rPr>
               <w:t>Gross Fixed Capital Formation</w:t>
             </w:r>
@@ -736,15 +682,13 @@
                 <w:rFonts w:asciiTheme="majorBidi" w:hAnsiTheme="majorBidi" w:cstheme="majorBidi"/>
                 <w:sz w:val="24"/>
                 <w:szCs w:val="24"/>
-                <w:lang w:val="en-IL"/>
-              </w:rPr>
-            </w:pPr>
-            <w:r>
-              <w:rPr>
-                <w:rFonts w:asciiTheme="majorBidi" w:hAnsiTheme="majorBidi" w:cstheme="majorBidi"/>
-                <w:sz w:val="24"/>
-                <w:szCs w:val="24"/>
-                <w:lang w:val="en-IL"/>
+              </w:rPr>
+            </w:pPr>
+            <w:r>
+              <w:rPr>
+                <w:rFonts w:asciiTheme="majorBidi" w:hAnsiTheme="majorBidi" w:cstheme="majorBidi"/>
+                <w:sz w:val="24"/>
+                <w:szCs w:val="24"/>
               </w:rPr>
               <w:t>Investment in fixed assets: buildings, machinery, infrastructure, etc.</w:t>
             </w:r>
@@ -768,7 +712,6 @@
                 <w:rFonts w:asciiTheme="majorBidi" w:hAnsiTheme="majorBidi" w:cstheme="majorBidi"/>
                 <w:sz w:val="24"/>
                 <w:szCs w:val="24"/>
-                <w:lang w:val="en-IL"/>
               </w:rPr>
             </w:pPr>
             <w:r>
@@ -778,7 +721,6 @@
                 <w:bCs/>
                 <w:sz w:val="24"/>
                 <w:szCs w:val="24"/>
-                <w:lang w:val="en-IL"/>
               </w:rPr>
               <w:t>INVNT</w:t>
             </w:r>
@@ -797,15 +739,13 @@
                 <w:rFonts w:asciiTheme="majorBidi" w:hAnsiTheme="majorBidi" w:cstheme="majorBidi"/>
                 <w:sz w:val="24"/>
                 <w:szCs w:val="24"/>
-                <w:lang w:val="en-IL"/>
-              </w:rPr>
-            </w:pPr>
-            <w:r>
-              <w:rPr>
-                <w:rFonts w:asciiTheme="majorBidi" w:hAnsiTheme="majorBidi" w:cstheme="majorBidi"/>
-                <w:sz w:val="24"/>
-                <w:szCs w:val="24"/>
-                <w:lang w:val="en-IL"/>
+              </w:rPr>
+            </w:pPr>
+            <w:r>
+              <w:rPr>
+                <w:rFonts w:asciiTheme="majorBidi" w:hAnsiTheme="majorBidi" w:cstheme="majorBidi"/>
+                <w:sz w:val="24"/>
+                <w:szCs w:val="24"/>
               </w:rPr>
               <w:t>Changes in Inventories</w:t>
             </w:r>
@@ -824,15 +764,13 @@
                 <w:rFonts w:asciiTheme="majorBidi" w:hAnsiTheme="majorBidi" w:cstheme="majorBidi"/>
                 <w:sz w:val="24"/>
                 <w:szCs w:val="24"/>
-                <w:lang w:val="en-IL"/>
-              </w:rPr>
-            </w:pPr>
-            <w:r>
-              <w:rPr>
-                <w:rFonts w:asciiTheme="majorBidi" w:hAnsiTheme="majorBidi" w:cstheme="majorBidi"/>
-                <w:sz w:val="24"/>
-                <w:szCs w:val="24"/>
-                <w:lang w:val="en-IL"/>
+              </w:rPr>
+            </w:pPr>
+            <w:r>
+              <w:rPr>
+                <w:rFonts w:asciiTheme="majorBidi" w:hAnsiTheme="majorBidi" w:cstheme="majorBidi"/>
+                <w:sz w:val="24"/>
+                <w:szCs w:val="24"/>
               </w:rPr>
               <w:t>Net accumulation of goods held in inventory by businesses.</w:t>
             </w:r>
@@ -856,7 +794,6 @@
                 <w:rFonts w:asciiTheme="majorBidi" w:hAnsiTheme="majorBidi" w:cstheme="majorBidi"/>
                 <w:sz w:val="24"/>
                 <w:szCs w:val="24"/>
-                <w:lang w:val="en-IL"/>
               </w:rPr>
             </w:pPr>
             <w:r>
@@ -866,7 +803,6 @@
                 <w:bCs/>
                 <w:sz w:val="24"/>
                 <w:szCs w:val="24"/>
-                <w:lang w:val="en-IL"/>
               </w:rPr>
               <w:t>CONS_NONRES</w:t>
             </w:r>
@@ -885,15 +821,13 @@
                 <w:rFonts w:asciiTheme="majorBidi" w:hAnsiTheme="majorBidi" w:cstheme="majorBidi"/>
                 <w:sz w:val="24"/>
                 <w:szCs w:val="24"/>
-                <w:lang w:val="en-IL"/>
-              </w:rPr>
-            </w:pPr>
-            <w:r>
-              <w:rPr>
-                <w:rFonts w:asciiTheme="majorBidi" w:hAnsiTheme="majorBidi" w:cstheme="majorBidi"/>
-                <w:sz w:val="24"/>
-                <w:szCs w:val="24"/>
-                <w:lang w:val="en-IL"/>
+              </w:rPr>
+            </w:pPr>
+            <w:r>
+              <w:rPr>
+                <w:rFonts w:asciiTheme="majorBidi" w:hAnsiTheme="majorBidi" w:cstheme="majorBidi"/>
+                <w:sz w:val="24"/>
+                <w:szCs w:val="24"/>
               </w:rPr>
               <w:t>Final Consumption Expenditure: Non-residents</w:t>
             </w:r>
@@ -912,15 +846,13 @@
                 <w:rFonts w:asciiTheme="majorBidi" w:hAnsiTheme="majorBidi" w:cstheme="majorBidi"/>
                 <w:sz w:val="24"/>
                 <w:szCs w:val="24"/>
-                <w:lang w:val="en-IL"/>
-              </w:rPr>
-            </w:pPr>
-            <w:r>
-              <w:rPr>
-                <w:rFonts w:asciiTheme="majorBidi" w:hAnsiTheme="majorBidi" w:cstheme="majorBidi"/>
-                <w:sz w:val="24"/>
-                <w:szCs w:val="24"/>
-                <w:lang w:val="en-IL"/>
+              </w:rPr>
+            </w:pPr>
+            <w:r>
+              <w:rPr>
+                <w:rFonts w:asciiTheme="majorBidi" w:hAnsiTheme="majorBidi" w:cstheme="majorBidi"/>
+                <w:sz w:val="24"/>
+                <w:szCs w:val="24"/>
               </w:rPr>
               <w:t>Consumption by non-residents in the domestic economy (e.g., tourists). Often a small component.</w:t>
             </w:r>
@@ -944,7 +876,6 @@
                 <w:rFonts w:asciiTheme="majorBidi" w:hAnsiTheme="majorBidi" w:cstheme="majorBidi"/>
                 <w:sz w:val="24"/>
                 <w:szCs w:val="24"/>
-                <w:lang w:val="en-IL"/>
               </w:rPr>
             </w:pPr>
             <w:r>
@@ -954,7 +885,6 @@
                 <w:bCs/>
                 <w:sz w:val="24"/>
                 <w:szCs w:val="24"/>
-                <w:lang w:val="en-IL"/>
               </w:rPr>
               <w:t>EXPO</w:t>
             </w:r>
@@ -973,15 +903,13 @@
                 <w:rFonts w:asciiTheme="majorBidi" w:hAnsiTheme="majorBidi" w:cstheme="majorBidi"/>
                 <w:sz w:val="24"/>
                 <w:szCs w:val="24"/>
-                <w:lang w:val="en-IL"/>
-              </w:rPr>
-            </w:pPr>
-            <w:r>
-              <w:rPr>
-                <w:rFonts w:asciiTheme="majorBidi" w:hAnsiTheme="majorBidi" w:cstheme="majorBidi"/>
-                <w:sz w:val="24"/>
-                <w:szCs w:val="24"/>
-                <w:lang w:val="en-IL"/>
+              </w:rPr>
+            </w:pPr>
+            <w:r>
+              <w:rPr>
+                <w:rFonts w:asciiTheme="majorBidi" w:hAnsiTheme="majorBidi" w:cstheme="majorBidi"/>
+                <w:sz w:val="24"/>
+                <w:szCs w:val="24"/>
               </w:rPr>
               <w:t>Exports of Goods and Services</w:t>
             </w:r>
@@ -1000,15 +928,13 @@
                 <w:rFonts w:asciiTheme="majorBidi" w:hAnsiTheme="majorBidi" w:cstheme="majorBidi"/>
                 <w:sz w:val="24"/>
                 <w:szCs w:val="24"/>
-                <w:lang w:val="en-IL"/>
-              </w:rPr>
-            </w:pPr>
-            <w:r>
-              <w:rPr>
-                <w:rFonts w:asciiTheme="majorBidi" w:hAnsiTheme="majorBidi" w:cstheme="majorBidi"/>
-                <w:sz w:val="24"/>
-                <w:szCs w:val="24"/>
-                <w:lang w:val="en-IL"/>
+              </w:rPr>
+            </w:pPr>
+            <w:r>
+              <w:rPr>
+                <w:rFonts w:asciiTheme="majorBidi" w:hAnsiTheme="majorBidi" w:cstheme="majorBidi"/>
+                <w:sz w:val="24"/>
+                <w:szCs w:val="24"/>
               </w:rPr>
               <w:t>Value of goods and services sold abroad.</w:t>
             </w:r>
@@ -1023,7 +949,6 @@
           <w:rFonts w:asciiTheme="majorBidi" w:hAnsiTheme="majorBidi" w:cstheme="majorBidi"/>
           <w:sz w:val="24"/>
           <w:szCs w:val="24"/>
-          <w:lang w:val="en-IL"/>
         </w:rPr>
       </w:pPr>
     </w:p>
@@ -1638,6 +1563,7 @@
   <w:style w:type="character" w:default="1" w:styleId="DefaultParagraphFont">
     <w:name w:val="Default Paragraph Font"/>
     <w:uiPriority w:val="1"/>
+    <w:semiHidden/>
     <w:unhideWhenUsed/>
   </w:style>
   <w:style w:type="table" w:default="1" w:styleId="TableNormal">

</xml_diff>